<commit_message>
update handbook, quickstart, and README
</commit_message>
<xml_diff>
--- a/documents/NightWatch_Quickstart.docx
+++ b/documents/NightWatch_Quickstart.docx
@@ -112,7 +112,7 @@
           <w:sz w:val="20"/>
           <w:szCs w:val="20"/>
         </w:rPr>
-        <w:t xml:space="preserve">Go to swl713.github.io/night-watch in Safari or Chrome. Enter the passphrase shared in your Telegram group. Tip: tap Share → Add to Home Screen for a full-screen icon.</w:t>
+        <w:t xml:space="preserve">Go to swl713.github.io/night-watch in Safari or Chrome. Enter the passphrase from Telegram. Tip: tap Share → Add to Home Screen for full-screen mode and easier access.</w:t>
       </w:r>
     </w:p>
     <w:p>
@@ -154,7 +154,7 @@
           <w:sz w:val="20"/>
           <w:szCs w:val="20"/>
         </w:rPr>
-        <w:t xml:space="preserve">The top panel shows current aurora intensity, Bz (the key number — negative = good), chase quality, moon interference, and astronomical darkness. Swipe the time slider to preview future hours.</w:t>
+        <w:t xml:space="preserve">The top panel shows current aurora intensity, Bz (negative = good), Chase Quality, moon interference, and astronomical darkness. Scrub the time slider at the bottom to preview future hours.</w:t>
       </w:r>
     </w:p>
     <w:p>
@@ -196,7 +196,7 @@
           <w:sz w:val="20"/>
           <w:szCs w:val="20"/>
         </w:rPr>
-        <w:t xml:space="preserve">Combined mode (default) shows cloud cover in red overlaid on light pollution. Clear dark areas are transparent. Tap any colored pin to see a specific spot's cloud forecast and photos.</w:t>
+        <w:t xml:space="preserve">Combined mode (default) shows cloud cover in red over light pollution. Clear dark areas are transparent — that's where you want to go. Tap any colored pin to see a spot's cloud forecast.</w:t>
       </w:r>
     </w:p>
     <w:p>
@@ -243,7 +243,7 @@
       <w:tr>
         <w:tc>
           <w:tcPr>
-            <w:tcW w:type="dxa" w:w="2400"/>
+            <w:tcW w:type="dxa" w:w="3360"/>
             <w:tcBorders>
               <w:top w:val="single" w:color="CCCCCC" w:sz="1"/>
               <w:left w:val="single" w:color="CCCCCC" w:sz="1"/>
@@ -274,7 +274,7 @@
         </w:tc>
         <w:tc>
           <w:tcPr>
-            <w:tcW w:type="dxa" w:w="3840"/>
+            <w:tcW w:type="dxa" w:w="3360"/>
             <w:tcBorders>
               <w:top w:val="single" w:color="CCCCCC" w:sz="1"/>
               <w:left w:val="single" w:color="CCCCCC" w:sz="1"/>
@@ -305,7 +305,7 @@
         </w:tc>
         <w:tc>
           <w:tcPr>
-            <w:tcW w:type="dxa" w:w="3840"/>
+            <w:tcW w:type="dxa" w:w="3360"/>
             <w:tcBorders>
               <w:top w:val="single" w:color="CCCCCC" w:sz="1"/>
               <w:left w:val="single" w:color="CCCCCC" w:sz="1"/>
@@ -338,7 +338,7 @@
       <w:tr>
         <w:tc>
           <w:tcPr>
-            <w:tcW w:type="dxa" w:w="2400"/>
+            <w:tcW w:type="dxa" w:w="3360"/>
             <w:tcBorders>
               <w:top w:val="single" w:color="CCCCCC" w:sz="1"/>
               <w:left w:val="single" w:color="CCCCCC" w:sz="1"/>
@@ -357,6 +357,8 @@
             <w:r>
               <w:rPr>
                 <w:rFonts w:ascii="Arial" w:cs="Arial" w:eastAsia="Arial" w:hAnsi="Arial"/>
+                <w:b w:val="false"/>
+                <w:bCs w:val="false"/>
                 <w:color w:val="222222"/>
                 <w:sz w:val="18"/>
                 <w:szCs w:val="18"/>
@@ -367,7 +369,7 @@
         </w:tc>
         <w:tc>
           <w:tcPr>
-            <w:tcW w:type="dxa" w:w="3840"/>
+            <w:tcW w:type="dxa" w:w="3360"/>
             <w:tcBorders>
               <w:top w:val="single" w:color="CCCCCC" w:sz="1"/>
               <w:left w:val="single" w:color="CCCCCC" w:sz="1"/>
@@ -386,6 +388,8 @@
             <w:r>
               <w:rPr>
                 <w:rFonts w:ascii="Arial" w:cs="Arial" w:eastAsia="Arial" w:hAnsi="Arial"/>
+                <w:b w:val="false"/>
+                <w:bCs w:val="false"/>
                 <w:color w:val="222222"/>
                 <w:sz w:val="18"/>
                 <w:szCs w:val="18"/>
@@ -396,7 +400,7 @@
         </w:tc>
         <w:tc>
           <w:tcPr>
-            <w:tcW w:type="dxa" w:w="3840"/>
+            <w:tcW w:type="dxa" w:w="3360"/>
             <w:tcBorders>
               <w:top w:val="single" w:color="CCCCCC" w:sz="1"/>
               <w:left w:val="single" w:color="CCCCCC" w:sz="1"/>
@@ -415,6 +419,8 @@
             <w:r>
               <w:rPr>
                 <w:rFonts w:ascii="Arial" w:cs="Arial" w:eastAsia="Arial" w:hAnsi="Arial"/>
+                <w:b w:val="false"/>
+                <w:bCs w:val="false"/>
                 <w:color w:val="222222"/>
                 <w:sz w:val="18"/>
                 <w:szCs w:val="18"/>
@@ -427,7 +433,7 @@
       <w:tr>
         <w:tc>
           <w:tcPr>
-            <w:tcW w:type="dxa" w:w="2400"/>
+            <w:tcW w:type="dxa" w:w="3360"/>
             <w:tcBorders>
               <w:top w:val="single" w:color="CCCCCC" w:sz="1"/>
               <w:left w:val="single" w:color="CCCCCC" w:sz="1"/>
@@ -446,6 +452,8 @@
             <w:r>
               <w:rPr>
                 <w:rFonts w:ascii="Arial" w:cs="Arial" w:eastAsia="Arial" w:hAnsi="Arial"/>
+                <w:b w:val="false"/>
+                <w:bCs w:val="false"/>
                 <w:color w:val="222222"/>
                 <w:sz w:val="18"/>
                 <w:szCs w:val="18"/>
@@ -456,7 +464,7 @@
         </w:tc>
         <w:tc>
           <w:tcPr>
-            <w:tcW w:type="dxa" w:w="3840"/>
+            <w:tcW w:type="dxa" w:w="3360"/>
             <w:tcBorders>
               <w:top w:val="single" w:color="CCCCCC" w:sz="1"/>
               <w:left w:val="single" w:color="CCCCCC" w:sz="1"/>
@@ -475,6 +483,8 @@
             <w:r>
               <w:rPr>
                 <w:rFonts w:ascii="Arial" w:cs="Arial" w:eastAsia="Arial" w:hAnsi="Arial"/>
+                <w:b w:val="false"/>
+                <w:bCs w:val="false"/>
                 <w:color w:val="222222"/>
                 <w:sz w:val="18"/>
                 <w:szCs w:val="18"/>
@@ -485,7 +495,7 @@
         </w:tc>
         <w:tc>
           <w:tcPr>
-            <w:tcW w:type="dxa" w:w="3840"/>
+            <w:tcW w:type="dxa" w:w="3360"/>
             <w:tcBorders>
               <w:top w:val="single" w:color="CCCCCC" w:sz="1"/>
               <w:left w:val="single" w:color="CCCCCC" w:sz="1"/>
@@ -504,6 +514,8 @@
             <w:r>
               <w:rPr>
                 <w:rFonts w:ascii="Arial" w:cs="Arial" w:eastAsia="Arial" w:hAnsi="Arial"/>
+                <w:b w:val="false"/>
+                <w:bCs w:val="false"/>
                 <w:color w:val="222222"/>
                 <w:sz w:val="18"/>
                 <w:szCs w:val="18"/>
@@ -516,7 +528,7 @@
       <w:tr>
         <w:tc>
           <w:tcPr>
-            <w:tcW w:type="dxa" w:w="2400"/>
+            <w:tcW w:type="dxa" w:w="3360"/>
             <w:tcBorders>
               <w:top w:val="single" w:color="CCCCCC" w:sz="1"/>
               <w:left w:val="single" w:color="CCCCCC" w:sz="1"/>
@@ -535,6 +547,8 @@
             <w:r>
               <w:rPr>
                 <w:rFonts w:ascii="Arial" w:cs="Arial" w:eastAsia="Arial" w:hAnsi="Arial"/>
+                <w:b w:val="false"/>
+                <w:bCs w:val="false"/>
                 <w:color w:val="222222"/>
                 <w:sz w:val="18"/>
                 <w:szCs w:val="18"/>
@@ -545,7 +559,7 @@
         </w:tc>
         <w:tc>
           <w:tcPr>
-            <w:tcW w:type="dxa" w:w="3840"/>
+            <w:tcW w:type="dxa" w:w="3360"/>
             <w:tcBorders>
               <w:top w:val="single" w:color="CCCCCC" w:sz="1"/>
               <w:left w:val="single" w:color="CCCCCC" w:sz="1"/>
@@ -564,6 +578,8 @@
             <w:r>
               <w:rPr>
                 <w:rFonts w:ascii="Arial" w:cs="Arial" w:eastAsia="Arial" w:hAnsi="Arial"/>
+                <w:b w:val="false"/>
+                <w:bCs w:val="false"/>
                 <w:color w:val="222222"/>
                 <w:sz w:val="18"/>
                 <w:szCs w:val="18"/>
@@ -574,7 +590,7 @@
         </w:tc>
         <w:tc>
           <w:tcPr>
-            <w:tcW w:type="dxa" w:w="3840"/>
+            <w:tcW w:type="dxa" w:w="3360"/>
             <w:tcBorders>
               <w:top w:val="single" w:color="CCCCCC" w:sz="1"/>
               <w:left w:val="single" w:color="CCCCCC" w:sz="1"/>
@@ -593,6 +609,8 @@
             <w:r>
               <w:rPr>
                 <w:rFonts w:ascii="Arial" w:cs="Arial" w:eastAsia="Arial" w:hAnsi="Arial"/>
+                <w:b w:val="false"/>
+                <w:bCs w:val="false"/>
                 <w:color w:val="222222"/>
                 <w:sz w:val="18"/>
                 <w:szCs w:val="18"/>
@@ -605,7 +623,7 @@
       <w:tr>
         <w:tc>
           <w:tcPr>
-            <w:tcW w:type="dxa" w:w="2400"/>
+            <w:tcW w:type="dxa" w:w="3360"/>
             <w:tcBorders>
               <w:top w:val="single" w:color="CCCCCC" w:sz="1"/>
               <w:left w:val="single" w:color="CCCCCC" w:sz="1"/>
@@ -624,6 +642,8 @@
             <w:r>
               <w:rPr>
                 <w:rFonts w:ascii="Arial" w:cs="Arial" w:eastAsia="Arial" w:hAnsi="Arial"/>
+                <w:b w:val="false"/>
+                <w:bCs w:val="false"/>
                 <w:color w:val="222222"/>
                 <w:sz w:val="18"/>
                 <w:szCs w:val="18"/>
@@ -634,7 +654,7 @@
         </w:tc>
         <w:tc>
           <w:tcPr>
-            <w:tcW w:type="dxa" w:w="3840"/>
+            <w:tcW w:type="dxa" w:w="3360"/>
             <w:tcBorders>
               <w:top w:val="single" w:color="CCCCCC" w:sz="1"/>
               <w:left w:val="single" w:color="CCCCCC" w:sz="1"/>
@@ -653,6 +673,8 @@
             <w:r>
               <w:rPr>
                 <w:rFonts w:ascii="Arial" w:cs="Arial" w:eastAsia="Arial" w:hAnsi="Arial"/>
+                <w:b w:val="false"/>
+                <w:bCs w:val="false"/>
                 <w:color w:val="222222"/>
                 <w:sz w:val="18"/>
                 <w:szCs w:val="18"/>
@@ -663,7 +685,7 @@
         </w:tc>
         <w:tc>
           <w:tcPr>
-            <w:tcW w:type="dxa" w:w="3840"/>
+            <w:tcW w:type="dxa" w:w="3360"/>
             <w:tcBorders>
               <w:top w:val="single" w:color="CCCCCC" w:sz="1"/>
               <w:left w:val="single" w:color="CCCCCC" w:sz="1"/>
@@ -682,6 +704,8 @@
             <w:r>
               <w:rPr>
                 <w:rFonts w:ascii="Arial" w:cs="Arial" w:eastAsia="Arial" w:hAnsi="Arial"/>
+                <w:b w:val="false"/>
+                <w:bCs w:val="false"/>
                 <w:color w:val="222222"/>
                 <w:sz w:val="18"/>
                 <w:szCs w:val="18"/>
@@ -694,7 +718,7 @@
       <w:tr>
         <w:tc>
           <w:tcPr>
-            <w:tcW w:type="dxa" w:w="2400"/>
+            <w:tcW w:type="dxa" w:w="3360"/>
             <w:tcBorders>
               <w:top w:val="single" w:color="CCCCCC" w:sz="1"/>
               <w:left w:val="single" w:color="CCCCCC" w:sz="1"/>
@@ -713,6 +737,8 @@
             <w:r>
               <w:rPr>
                 <w:rFonts w:ascii="Arial" w:cs="Arial" w:eastAsia="Arial" w:hAnsi="Arial"/>
+                <w:b w:val="false"/>
+                <w:bCs w:val="false"/>
                 <w:color w:val="222222"/>
                 <w:sz w:val="18"/>
                 <w:szCs w:val="18"/>
@@ -723,7 +749,7 @@
         </w:tc>
         <w:tc>
           <w:tcPr>
-            <w:tcW w:type="dxa" w:w="3840"/>
+            <w:tcW w:type="dxa" w:w="3360"/>
             <w:tcBorders>
               <w:top w:val="single" w:color="CCCCCC" w:sz="1"/>
               <w:left w:val="single" w:color="CCCCCC" w:sz="1"/>
@@ -742,17 +768,19 @@
             <w:r>
               <w:rPr>
                 <w:rFonts w:ascii="Arial" w:cs="Arial" w:eastAsia="Arial" w:hAnsi="Arial"/>
-                <w:color w:val="222222"/>
-                <w:sz w:val="18"/>
-                <w:szCs w:val="18"/>
-              </w:rPr>
-              <w:t xml:space="preserve">80%+ (well past sunset)</w:t>
-            </w:r>
-          </w:p>
-        </w:tc>
-        <w:tc>
-          <w:tcPr>
-            <w:tcW w:type="dxa" w:w="3840"/>
+                <w:b w:val="false"/>
+                <w:bCs w:val="false"/>
+                <w:color w:val="222222"/>
+                <w:sz w:val="18"/>
+                <w:szCs w:val="18"/>
+              </w:rPr>
+              <w:t xml:space="preserve">80%+ (well after sunset)</w:t>
+            </w:r>
+          </w:p>
+        </w:tc>
+        <w:tc>
+          <w:tcPr>
+            <w:tcW w:type="dxa" w:w="3360"/>
             <w:tcBorders>
               <w:top w:val="single" w:color="CCCCCC" w:sz="1"/>
               <w:left w:val="single" w:color="CCCCCC" w:sz="1"/>
@@ -771,11 +799,108 @@
             <w:r>
               <w:rPr>
                 <w:rFonts w:ascii="Arial" w:cs="Arial" w:eastAsia="Arial" w:hAnsi="Arial"/>
+                <w:b w:val="false"/>
+                <w:bCs w:val="false"/>
                 <w:color w:val="222222"/>
                 <w:sz w:val="18"/>
                 <w:szCs w:val="18"/>
               </w:rPr>
               <w:t xml:space="preserve">Below 40% (twilight)</w:t>
+            </w:r>
+          </w:p>
+        </w:tc>
+      </w:tr>
+      <w:tr>
+        <w:tc>
+          <w:tcPr>
+            <w:tcW w:type="dxa" w:w="3360"/>
+            <w:tcBorders>
+              <w:top w:val="single" w:color="CCCCCC" w:sz="1"/>
+              <w:left w:val="single" w:color="CCCCCC" w:sz="1"/>
+              <w:bottom w:val="single" w:color="CCCCCC" w:sz="1"/>
+              <w:right w:val="single" w:color="CCCCCC" w:sz="1"/>
+            </w:tcBorders>
+            <w:shd w:fill="FFFFFF" w:val="clear"/>
+            <w:tcMar>
+              <w:top w:type="dxa" w:w="80"/>
+              <w:left w:type="dxa" w:w="120"/>
+              <w:bottom w:type="dxa" w:w="80"/>
+              <w:right w:type="dxa" w:w="120"/>
+            </w:tcMar>
+          </w:tcPr>
+          <w:p>
+            <w:r>
+              <w:rPr>
+                <w:rFonts w:ascii="Arial" w:cs="Arial" w:eastAsia="Arial" w:hAnsi="Arial"/>
+                <w:b w:val="false"/>
+                <w:bCs w:val="false"/>
+                <w:color w:val="222222"/>
+                <w:sz w:val="18"/>
+                <w:szCs w:val="18"/>
+              </w:rPr>
+              <w:t xml:space="preserve">Interference</w:t>
+            </w:r>
+          </w:p>
+        </w:tc>
+        <w:tc>
+          <w:tcPr>
+            <w:tcW w:type="dxa" w:w="3360"/>
+            <w:tcBorders>
+              <w:top w:val="single" w:color="CCCCCC" w:sz="1"/>
+              <w:left w:val="single" w:color="CCCCCC" w:sz="1"/>
+              <w:bottom w:val="single" w:color="CCCCCC" w:sz="1"/>
+              <w:right w:val="single" w:color="CCCCCC" w:sz="1"/>
+            </w:tcBorders>
+            <w:shd w:fill="FFFFFF" w:val="clear"/>
+            <w:tcMar>
+              <w:top w:type="dxa" w:w="80"/>
+              <w:left w:type="dxa" w:w="120"/>
+              <w:bottom w:type="dxa" w:w="80"/>
+              <w:right w:type="dxa" w:w="120"/>
+            </w:tcMar>
+          </w:tcPr>
+          <w:p>
+            <w:r>
+              <w:rPr>
+                <w:rFonts w:ascii="Arial" w:cs="Arial" w:eastAsia="Arial" w:hAnsi="Arial"/>
+                <w:b w:val="false"/>
+                <w:bCs w:val="false"/>
+                <w:color w:val="222222"/>
+                <w:sz w:val="18"/>
+                <w:szCs w:val="18"/>
+              </w:rPr>
+              <w:t xml:space="preserve">Under 25%</w:t>
+            </w:r>
+          </w:p>
+        </w:tc>
+        <w:tc>
+          <w:tcPr>
+            <w:tcW w:type="dxa" w:w="3360"/>
+            <w:tcBorders>
+              <w:top w:val="single" w:color="CCCCCC" w:sz="1"/>
+              <w:left w:val="single" w:color="CCCCCC" w:sz="1"/>
+              <w:bottom w:val="single" w:color="CCCCCC" w:sz="1"/>
+              <w:right w:val="single" w:color="CCCCCC" w:sz="1"/>
+            </w:tcBorders>
+            <w:shd w:fill="FFFFFF" w:val="clear"/>
+            <w:tcMar>
+              <w:top w:type="dxa" w:w="80"/>
+              <w:left w:type="dxa" w:w="120"/>
+              <w:bottom w:type="dxa" w:w="80"/>
+              <w:right w:type="dxa" w:w="120"/>
+            </w:tcMar>
+          </w:tcPr>
+          <w:p>
+            <w:r>
+              <w:rPr>
+                <w:rFonts w:ascii="Arial" w:cs="Arial" w:eastAsia="Arial" w:hAnsi="Arial"/>
+                <w:b w:val="false"/>
+                <w:bCs w:val="false"/>
+                <w:color w:val="222222"/>
+                <w:sz w:val="18"/>
+                <w:szCs w:val="18"/>
+              </w:rPr>
+              <w:t xml:space="preserve">Over 60% (bright moon up)</w:t>
             </w:r>
           </w:p>
         </w:tc>
@@ -835,7 +960,7 @@
           <w:sz w:val="20"/>
           <w:szCs w:val="20"/>
         </w:rPr>
-        <w:t xml:space="preserve">Tap REPORT AURORA in the bottom bar to log a live sighting. Your report appears as a teal ring for 5 hours.</w:t>
+        <w:t xml:space="preserve">Tap REPORT AURORA in the bottom bar to log a live sighting with GPS location and what you're observing. Your report shows as a teal ring for 5 hours.</w:t>
       </w:r>
     </w:p>
     <w:p>
@@ -848,7 +973,7 @@
           <w:sz w:val="22"/>
           <w:szCs w:val="22"/>
         </w:rPr>
-        <w:t xml:space="preserve">📍  </w:t>
+        <w:t xml:space="preserve">🌙  </w:t>
       </w:r>
       <w:r>
         <w:rPr>
@@ -859,7 +984,7 @@
           <w:sz w:val="20"/>
           <w:szCs w:val="20"/>
         </w:rPr>
-        <w:t xml:space="preserve">Add a spot:  </w:t>
+        <w:t xml:space="preserve">Night vision:  </w:t>
       </w:r>
       <w:r>
         <w:rPr>
@@ -868,7 +993,7 @@
           <w:sz w:val="20"/>
           <w:szCs w:val="20"/>
         </w:rPr>
-        <w:t xml:space="preserve">Tap + PLACE PIN, tap the map, fill in the details, submit for review.</w:t>
+        <w:t xml:space="preserve">Tap the crescent moon icon below the search button to switch the entire app to red/black night vision mode — protects your dark-adapted vision.</w:t>
       </w:r>
     </w:p>
     <w:p>
@@ -901,7 +1026,7 @@
           <w:sz w:val="20"/>
           <w:szCs w:val="20"/>
         </w:rPr>
-        <w:t xml:space="preserve">Tap the magnifying glass top-left on the map to search any location.</w:t>
+        <w:t xml:space="preserve">Tap the magnifying glass top-left on the map to search any city, park, or landmark.</w:t>
       </w:r>
     </w:p>
     <w:p>
@@ -914,7 +1039,7 @@
           <w:sz w:val="22"/>
           <w:szCs w:val="22"/>
         </w:rPr>
-        <w:t xml:space="preserve">🕐  </w:t>
+        <w:t xml:space="preserve">📍  </w:t>
       </w:r>
       <w:r>
         <w:rPr>
@@ -925,7 +1050,7 @@
           <w:sz w:val="20"/>
           <w:szCs w:val="20"/>
         </w:rPr>
-        <w:t xml:space="preserve">Plan ahead:  </w:t>
+        <w:t xml:space="preserve">Add a spot:  </w:t>
       </w:r>
       <w:r>
         <w:rPr>
@@ -934,7 +1059,7 @@
           <w:sz w:val="20"/>
           <w:szCs w:val="20"/>
         </w:rPr>
-        <w:t xml:space="preserve">Drag the time slider to preview cloud cover and space weather up to 8 hours out.</w:t>
+        <w:t xml:space="preserve">Tap + PLACE PIN, tap the map, fill in the details, and submit for review.</w:t>
       </w:r>
     </w:p>
     <w:p>
@@ -947,7 +1072,7 @@
           <w:sz w:val="22"/>
           <w:szCs w:val="22"/>
         </w:rPr>
-        <w:t xml:space="preserve">🏕️  </w:t>
+        <w:t xml:space="preserve">🕐  </w:t>
       </w:r>
       <w:r>
         <w:rPr>
@@ -958,7 +1083,7 @@
           <w:sz w:val="20"/>
           <w:szCs w:val="20"/>
         </w:rPr>
-        <w:t xml:space="preserve">Pick a dark spot:  </w:t>
+        <w:t xml:space="preserve">Plan ahead:  </w:t>
       </w:r>
       <w:r>
         <w:rPr>
@@ -967,7 +1092,7 @@
           <w:sz w:val="20"/>
           <w:szCs w:val="20"/>
         </w:rPr>
-        <w:t xml:space="preserve">Green pins = dark and clear. Red pins = cloudy or light-polluted. Tap for the 9-hour cloud forecast.</w:t>
+        <w:t xml:space="preserve">Drag the time slider to see cloud cover and space weather up to 8 hours out.</w:t>
       </w:r>
     </w:p>
     <w:p>
@@ -980,6 +1105,39 @@
           <w:sz w:val="22"/>
           <w:szCs w:val="22"/>
         </w:rPr>
+        <w:t xml:space="preserve">🏕️  </w:t>
+      </w:r>
+      <w:r>
+        <w:rPr>
+          <w:rFonts w:ascii="Arial" w:cs="Arial" w:eastAsia="Arial" w:hAnsi="Arial"/>
+          <w:b/>
+          <w:bCs/>
+          <w:color w:val="1A7A6E"/>
+          <w:sz w:val="20"/>
+          <w:szCs w:val="20"/>
+        </w:rPr>
+        <w:t xml:space="preserve">Pick best location:  </w:t>
+      </w:r>
+      <w:r>
+        <w:rPr>
+          <w:rFonts w:ascii="Arial" w:cs="Arial" w:eastAsia="Arial" w:hAnsi="Arial"/>
+          <w:color w:val="333333"/>
+          <w:sz w:val="20"/>
+          <w:szCs w:val="20"/>
+        </w:rPr>
+        <w:t xml:space="preserve">Green pins = dark and clear. Red = cloudy or light-polluted. Tap for the 9-hour cloud forecast.</w:t>
+      </w:r>
+    </w:p>
+    <w:p>
+      <w:pPr>
+        <w:spacing w:after="100" w:before="100"/>
+      </w:pPr>
+      <w:r>
+        <w:rPr>
+          <w:rFonts w:ascii="Arial" w:cs="Arial" w:eastAsia="Arial" w:hAnsi="Arial"/>
+          <w:sz w:val="22"/>
+          <w:szCs w:val="22"/>
+        </w:rPr>
         <w:t xml:space="preserve">📸  </w:t>
       </w:r>
       <w:r>
@@ -1001,6 +1159,39 @@
           <w:szCs w:val="20"/>
         </w:rPr>
         <w:t xml:space="preserve">Tap any spot pin → Photos tab → + SUBMIT A PHOTO to contribute to the community gallery.</w:t>
+      </w:r>
+    </w:p>
+    <w:p>
+      <w:pPr>
+        <w:spacing w:after="100" w:before="100"/>
+      </w:pPr>
+      <w:r>
+        <w:rPr>
+          <w:rFonts w:ascii="Arial" w:cs="Arial" w:eastAsia="Arial" w:hAnsi="Arial"/>
+          <w:sz w:val="22"/>
+          <w:szCs w:val="22"/>
+        </w:rPr>
+        <w:t xml:space="preserve">🚩  </w:t>
+      </w:r>
+      <w:r>
+        <w:rPr>
+          <w:rFonts w:ascii="Arial" w:cs="Arial" w:eastAsia="Arial" w:hAnsi="Arial"/>
+          <w:b/>
+          <w:bCs/>
+          <w:color w:val="1A7A6E"/>
+          <w:sz w:val="20"/>
+          <w:szCs w:val="20"/>
+        </w:rPr>
+        <w:t xml:space="preserve">Problem photo?:  </w:t>
+      </w:r>
+      <w:r>
+        <w:rPr>
+          <w:rFonts w:ascii="Arial" w:cs="Arial" w:eastAsia="Arial" w:hAnsi="Arial"/>
+          <w:color w:val="333333"/>
+          <w:sz w:val="20"/>
+          <w:szCs w:val="20"/>
+        </w:rPr>
+        <w:t xml:space="preserve">Tap the flag icon on any photo to send it to the admin for review.</w:t>
       </w:r>
     </w:p>
     <w:p>
@@ -1214,18 +1405,6 @@
       <w:lvlJc w:val="left"/>
       <w:pPr>
         <w:ind w:left="6480" w:hanging="360"/>
-      </w:pPr>
-    </w:lvl>
-  </w:abstractNum>
-  <w:abstractNum w:abstractNumId="2" w15:restartNumberingAfterBreak="0">
-    <w:multiLevelType w:val="hybridMultilevel"/>
-    <w:lvl w:ilvl="0" w15:tentative="1">
-      <w:start w:val="1"/>
-      <w:numFmt w:val="bullet"/>
-      <w:lvlText w:val="•"/>
-      <w:lvlJc w:val="left"/>
-      <w:pPr>
-        <w:ind w:left="720" w:hanging="360"/>
       </w:pPr>
     </w:lvl>
   </w:abstractNum>
@@ -1421,22 +1600,5 @@
       <w:szCs w:val="20"/>
     </w:rPr>
   </w:style>
-  <w:style w:type="paragraph" w:styleId="Heading1">
-    <w:name w:val="Heading 1"/>
-    <w:basedOn w:val="Normal"/>
-    <w:next w:val="Normal"/>
-    <w:qFormat/>
-    <w:pPr>
-      <w:spacing w:after="120" w:before="360"/>
-      <w:outlineLvl w:val="0"/>
-    </w:pPr>
-    <w:rPr>
-      <w:rFonts w:ascii="Arial" w:cs="Arial" w:eastAsia="Arial" w:hAnsi="Arial"/>
-      <w:b/>
-      <w:bCs/>
-      <w:sz w:val="32"/>
-      <w:szCs w:val="32"/>
-    </w:rPr>
-  </w:style>
 </w:styles>
 </file>
</xml_diff>